<commit_message>
Remove the wording-change version rows from SRS and SAD
SRS goes back to version 1.1 and SAD to version 1.0. Document
references in the SAD and Test Plan are updated to match.
</commit_message>
<xml_diff>
--- a/docs/SRS.docx
+++ b/docs/SRS.docx
@@ -24,7 +24,7 @@
     </w:p>
     <w:p>
       <w:r>
-        <w:t>Version 1.2</w:t>
+        <w:t>Version 1.1</w:t>
       </w:r>
     </w:p>
     <w:p>
@@ -483,64 +483,6 @@
           </w:p>
         </w:tc>
       </w:tr>
-      <w:tr>
-        <w:tc>
-          <w:tcPr>
-            <w:tcW w:type="dxa" w:w="2409"/>
-          </w:tcPr>
-          <w:p>
-            <w:r/>
-            <w:r>
-              <w:rPr>
-                <w:sz w:val="18"/>
-              </w:rPr>
-              <w:t>Tejas</w:t>
-            </w:r>
-          </w:p>
-        </w:tc>
-        <w:tc>
-          <w:tcPr>
-            <w:tcW w:type="dxa" w:w="2409"/>
-          </w:tcPr>
-          <w:p>
-            <w:r/>
-            <w:r>
-              <w:rPr>
-                <w:sz w:val="18"/>
-              </w:rPr>
-              <w:t>12-Oct-2026</w:t>
-            </w:r>
-          </w:p>
-        </w:tc>
-        <w:tc>
-          <w:tcPr>
-            <w:tcW w:type="dxa" w:w="2409"/>
-          </w:tcPr>
-          <w:p>
-            <w:r/>
-            <w:r>
-              <w:rPr>
-                <w:sz w:val="18"/>
-              </w:rPr>
-              <w:t>Simplified the wording of the document (no change to the requirements)</w:t>
-            </w:r>
-          </w:p>
-        </w:tc>
-        <w:tc>
-          <w:tcPr>
-            <w:tcW w:type="dxa" w:w="2409"/>
-          </w:tcPr>
-          <w:p>
-            <w:r/>
-            <w:r>
-              <w:rPr>
-                <w:sz w:val="18"/>
-              </w:rPr>
-              <w:t>1.2</w:t>
-            </w:r>
-          </w:p>
-        </w:tc>
-      </w:tr>
     </w:tbl>
     <w:p/>
     <w:p>
@@ -928,7 +870,7 @@
     </w:p>
     <w:p>
       <w:r>
-        <w:t>The Online Quiz System is a new, standalone console application. It is not an upgrade of an existing system and is not part of a larger product. It runs on a single machine as one C/C++ program, with no client-server split, no backend and no database. The flow is: User ↔ Console Program ↔ (optional) local question and result files. It is a mini-project for the Software Engineering course, so it is a small, offline, single-user tool.</w:t>
+        <w:t>The Online Quiz System is a new, standalone console application. It is not an upgrade of an existing system and is not part of a larger product. It runs on a single machine as one C/C++ program, with no client-server split, no backend and no database. The flow is: User ↔ Console Program ↔ (optional) local question and result files.</w:t>
       </w:r>
     </w:p>
     <w:p>

</xml_diff>